<commit_message>
Remove the ~70% ticket-reduction line from the resume
- Drop the "1,000 to 300 (approximately 70%)" Release Assistant bullet
  from the Word resume and re-export the PDF from it (same Carlito
  font and layout, still two pages, Oracle dates Mar 2019 - Jul 2021)
- Replace the old unlinked assets/ resume copy, which still had the
  claim and the old Oracle dates, with the same updated PDF so any
  previously shared links get the current version

Co-Authored-By: Claude Opus 5.5 <noreply@anthropic.com>
Claude-Session: https://claude.ai/code/session_01G9BpPp1twgfqv48CZAfcQL
</commit_message>
<xml_diff>
--- a/Kunal-Mugalkhod-Resume.docx
+++ b/Kunal-Mugalkhod-Resume.docx
@@ -44,7 +44,7 @@
         </w:rPr>
         <w:t xml:space="preserve">Pune, India  |  </w:t>
       </w:r>
-      <w:hyperlink w:history="1" r:id="rId930hdmmzvgfwfxng99pc4">
+      <w:hyperlink w:history="1" r:id="rIdwruzix9zesdui53muikef">
         <w:r>
           <w:rPr>
             <w:rFonts w:ascii="Calibri" w:cs="Calibri" w:eastAsia="Calibri" w:hAnsi="Calibri"/>
@@ -63,7 +63,7 @@
         </w:rPr>
         <w:t xml:space="preserve">  |  </w:t>
       </w:r>
-      <w:hyperlink w:history="1" r:id="rId0vxljivogwtaf7x-ufm7e">
+      <w:hyperlink w:history="1" r:id="rIdgayiukjgq5ymwa3nxb8-q">
         <w:r>
           <w:rPr>
             <w:rFonts w:ascii="Calibri" w:cs="Calibri" w:eastAsia="Calibri" w:hAnsi="Calibri"/>
@@ -82,7 +82,7 @@
         </w:rPr>
         <w:t xml:space="preserve">  |  </w:t>
       </w:r>
-      <w:hyperlink w:history="1" r:id="rIdtpulasdoebugaioroxdyc">
+      <w:hyperlink w:history="1" r:id="rIdnhdkume9oa0wbm39asmne">
         <w:r>
           <w:rPr>
             <w:rFonts w:ascii="Calibri" w:cs="Calibri" w:eastAsia="Calibri" w:hAnsi="Calibri"/>
@@ -267,7 +267,7 @@
       <w:pPr>
         <w:spacing w:after="80" w:line="259"/>
       </w:pPr>
-      <w:hyperlink w:history="1" r:id="rIdunlxogzpqgqc5dtaqg8hv">
+      <w:hyperlink w:history="1" r:id="rIdbpfzixcladft72n4xe4g4">
         <w:r>
           <w:rPr>
             <w:rFonts w:ascii="Calibri" w:cs="Calibri" w:eastAsia="Calibri" w:hAnsi="Calibri"/>
@@ -465,24 +465,6 @@
           <w:szCs w:val="21"/>
         </w:rPr>
         <w:t xml:space="preserve">Built Angular/FastAPI workflows and Jira/GitLab MCP servers for release notes, environment-tag comparisons, sprint analytics, security reports, and XRAY test-execution analysis.</w:t>
-      </w:r>
-    </w:p>
-    <w:p>
-      <w:pPr>
-        <w:pStyle w:val="ListParagraph"/>
-        <w:numPr>
-          <w:ilvl w:val="0"/>
-          <w:numId w:val="2"/>
-        </w:numPr>
-        <w:spacing w:after="20" w:line="259"/>
-      </w:pPr>
-      <w:r>
-        <w:rPr>
-          <w:rFonts w:ascii="Calibri" w:cs="Calibri" w:eastAsia="Calibri" w:hAnsi="Calibri"/>
-          <w:sz w:val="21"/>
-          <w:szCs w:val="21"/>
-        </w:rPr>
-        <w:t xml:space="preserve">Reduced candidate tickets for commit analysis from about 1,000 to 300 (approximately 70%) by filtering for tickets with commits before downstream processing.</w:t>
       </w:r>
     </w:p>
     <w:p>

</xml_diff>

<commit_message>
Remove the ~70% ticket-reduction line from the resume (#7)
- Drop the "1,000 to 300 (approximately 70%)" Release Assistant bullet
  from the Word resume and re-export the PDF from it (same Carlito
  font and layout, still two pages, Oracle dates Mar 2019 - Jul 2021)
- Replace the old unlinked assets/ resume copy, which still had the
  claim and the old Oracle dates, with the same updated PDF so any
  previously shared links get the current version


Claude-Session: https://claude.ai/code/session_01G9BpPp1twgfqv48CZAfcQL

Co-authored-by: Claude <noreply@anthropic.com>
</commit_message>
<xml_diff>
--- a/Kunal-Mugalkhod-Resume.docx
+++ b/Kunal-Mugalkhod-Resume.docx
@@ -44,7 +44,7 @@
         </w:rPr>
         <w:t xml:space="preserve">Pune, India  |  </w:t>
       </w:r>
-      <w:hyperlink w:history="1" r:id="rId930hdmmzvgfwfxng99pc4">
+      <w:hyperlink w:history="1" r:id="rIdwruzix9zesdui53muikef">
         <w:r>
           <w:rPr>
             <w:rFonts w:ascii="Calibri" w:cs="Calibri" w:eastAsia="Calibri" w:hAnsi="Calibri"/>
@@ -63,7 +63,7 @@
         </w:rPr>
         <w:t xml:space="preserve">  |  </w:t>
       </w:r>
-      <w:hyperlink w:history="1" r:id="rId0vxljivogwtaf7x-ufm7e">
+      <w:hyperlink w:history="1" r:id="rIdgayiukjgq5ymwa3nxb8-q">
         <w:r>
           <w:rPr>
             <w:rFonts w:ascii="Calibri" w:cs="Calibri" w:eastAsia="Calibri" w:hAnsi="Calibri"/>
@@ -82,7 +82,7 @@
         </w:rPr>
         <w:t xml:space="preserve">  |  </w:t>
       </w:r>
-      <w:hyperlink w:history="1" r:id="rIdtpulasdoebugaioroxdyc">
+      <w:hyperlink w:history="1" r:id="rIdnhdkume9oa0wbm39asmne">
         <w:r>
           <w:rPr>
             <w:rFonts w:ascii="Calibri" w:cs="Calibri" w:eastAsia="Calibri" w:hAnsi="Calibri"/>
@@ -267,7 +267,7 @@
       <w:pPr>
         <w:spacing w:after="80" w:line="259"/>
       </w:pPr>
-      <w:hyperlink w:history="1" r:id="rIdunlxogzpqgqc5dtaqg8hv">
+      <w:hyperlink w:history="1" r:id="rIdbpfzixcladft72n4xe4g4">
         <w:r>
           <w:rPr>
             <w:rFonts w:ascii="Calibri" w:cs="Calibri" w:eastAsia="Calibri" w:hAnsi="Calibri"/>
@@ -465,24 +465,6 @@
           <w:szCs w:val="21"/>
         </w:rPr>
         <w:t xml:space="preserve">Built Angular/FastAPI workflows and Jira/GitLab MCP servers for release notes, environment-tag comparisons, sprint analytics, security reports, and XRAY test-execution analysis.</w:t>
-      </w:r>
-    </w:p>
-    <w:p>
-      <w:pPr>
-        <w:pStyle w:val="ListParagraph"/>
-        <w:numPr>
-          <w:ilvl w:val="0"/>
-          <w:numId w:val="2"/>
-        </w:numPr>
-        <w:spacing w:after="20" w:line="259"/>
-      </w:pPr>
-      <w:r>
-        <w:rPr>
-          <w:rFonts w:ascii="Calibri" w:cs="Calibri" w:eastAsia="Calibri" w:hAnsi="Calibri"/>
-          <w:sz w:val="21"/>
-          <w:szCs w:val="21"/>
-        </w:rPr>
-        <w:t xml:space="preserve">Reduced candidate tickets for commit analysis from about 1,000 to 300 (approximately 70%) by filtering for tickets with commits before downstream processing.</w:t>
       </w:r>
     </w:p>
     <w:p>

</xml_diff>